<commit_message>
Fix footer placeholders and assignment line to match official template
</commit_message>
<xml_diff>
--- a/report_filled.docx
+++ b/report_filled.docx
@@ -42,6 +42,15 @@
         </w:rPr>
         <w:t>LIN TONG, G2608825L</w:t>
       </w:r>
+      <w:r>
+        <w:rPr>
+          <w:rFonts w:ascii="Times New Roman" w:hAnsi="Times New Roman"/>
+          <w:color w:val="000000"/>
+          <w:lang w:val="en-GB"/>
+        </w:rPr>
+        <w:br/>
+        <w:t>IN6227-2023-Assignment-1</w:t>
+      </w:r>
     </w:p>
     <w:p>
       <w:pPr>
@@ -69,9 +78,10 @@
         <w:sectPr>
           <w:headerReference w:type="even" r:id="rId8"/>
           <w:headerReference w:type="default" r:id="rId9"/>
-          <w:footerReference w:type="default" r:id="rId10"/>
-          <w:headerReference w:type="first" r:id="rId11"/>
-          <w:footerReference w:type="first" r:id="rId12"/>
+          <w:footerReference w:type="even" r:id="rId10"/>
+          <w:footerReference w:type="default" r:id="rId11"/>
+          <w:headerReference w:type="first" r:id="rId12"/>
+          <w:footerReference w:type="first" r:id="rId13"/>
           <w:pgSz w:w="11906" w:h="16838" w:code="9"/>
           <w:pgMar w:top="1440" w:right="1080" w:bottom="1440" w:left="1080" w:header="709" w:footer="709" w:gutter="0"/>
           <w:pgNumType w:start="1"/>
@@ -267,7 +277,7 @@
           <w:sz w:val="20"/>
           <w:lang w:val="en-GB"/>
         </w:rPr>
-        <w:pict w14:anchorId="730CCBFE">
+        <w:pict w14:anchorId="63D4342B">
           <v:shapetype id="_x0000_t75" coordsize="21600,21600" o:spt="75" o:preferrelative="t" path="m@4@5l@4@11@9@11@9@5xe" filled="f" stroked="f">
             <v:stroke joinstyle="miter"/>
             <v:formulas>
@@ -287,8 +297,8 @@
             <v:path o:extrusionok="f" gradientshapeok="t" o:connecttype="rect"/>
             <o:lock v:ext="edit" aspectratio="t"/>
           </v:shapetype>
-          <v:shape id="_x0000_i1025" type="#_x0000_t75" style="width:229.55pt;height:200.3pt">
-            <v:imagedata r:id="rId13" o:title="confusion_matrix"/>
+          <v:shape id="_x0000_i1025" type="#_x0000_t75" style="width:229pt;height:200.5pt">
+            <v:imagedata r:id="rId14" o:title="confusion_matrix"/>
           </v:shape>
         </w:pict>
       </w:r>
@@ -1097,105 +1107,104 @@
 
 <file path=word/footer1.xml><?xml version="1.0" encoding="utf-8"?>
 <w:ftr xmlns:wpc="http://schemas.microsoft.com/office/word/2010/wordprocessingCanvas" xmlns:cx="http://schemas.microsoft.com/office/drawing/2014/chartex" xmlns:cx1="http://schemas.microsoft.com/office/drawing/2015/9/8/chartex" xmlns:cx2="http://schemas.microsoft.com/office/drawing/2015/10/21/chartex" xmlns:cx3="http://schemas.microsoft.com/office/drawing/2016/5/9/chartex" xmlns:cx4="http://schemas.microsoft.com/office/drawing/2016/5/10/chartex" xmlns:cx5="http://schemas.microsoft.com/office/drawing/2016/5/11/chartex" xmlns:cx6="http://schemas.microsoft.com/office/drawing/2016/5/12/chartex" xmlns:cx7="http://schemas.microsoft.com/office/drawing/2016/5/13/chartex" xmlns:cx8="http://schemas.microsoft.com/office/drawing/2016/5/14/chartex" xmlns:mc="http://schemas.openxmlformats.org/markup-compatibility/2006" xmlns:aink="http://schemas.microsoft.com/office/drawing/2016/ink" xmlns:am3d="http://schemas.microsoft.com/office/drawing/2017/model3d" xmlns:o="urn:schemas-microsoft-com:office:office" xmlns:oel="http://schemas.microsoft.com/office/2019/extlst" xmlns:r="http://schemas.openxmlformats.org/officeDocument/2006/relationships" xmlns:m="http://schemas.openxmlformats.org/officeDocument/2006/math" xmlns:v="urn:schemas-microsoft-com:vml" xmlns:wp14="http://schemas.microsoft.com/office/word/2010/wordprocessingDrawing" xmlns:wp="http://schemas.openxmlformats.org/drawingml/2006/wordprocessingDrawing" xmlns:w10="urn:schemas-microsoft-com:office:word" xmlns:w="http://schemas.openxmlformats.org/wordprocessingml/2006/main" xmlns:w14="http://schemas.microsoft.com/office/word/2010/wordml" xmlns:w15="http://schemas.microsoft.com/office/word/2012/wordml" xmlns:w16cex="http://schemas.microsoft.com/office/word/2018/wordml/cex" xmlns:w16cid="http://schemas.microsoft.com/office/word/2016/wordml/cid" xmlns:w16="http://schemas.microsoft.com/office/word/2018/wordml" xmlns:w16du="http://schemas.microsoft.com/office/word/2023/wordml/word16du" xmlns:w16sdtdh="http://schemas.microsoft.com/office/word/2020/wordml/sdtdatahash" xmlns:w16sdtfl="http://schemas.microsoft.com/office/word/2024/wordml/sdtformatlock" xmlns:w16se="http://schemas.microsoft.com/office/word/2015/wordml/symex" xmlns:wpg="http://schemas.microsoft.com/office/word/2010/wordprocessingGroup" xmlns:wpi="http://schemas.microsoft.com/office/word/2010/wordprocessingInk" xmlns:wne="http://schemas.microsoft.com/office/word/2006/wordml" xmlns:wps="http://schemas.microsoft.com/office/word/2010/wordprocessingShape" mc:Ignorable="w14 w15 w16se w16cid w16 w16cex w16sdtdh w16sdtfl w16du wp14">
-  <w:tbl>
-    <w:tblPr>
-      <w:tblW w:w="5000" w:type="pct"/>
-      <w:tblCellMar>
-        <w:left w:w="0" w:type="dxa"/>
-        <w:right w:w="0" w:type="dxa"/>
-      </w:tblCellMar>
-      <w:tblLook w:val="04A0" w:firstRow="1" w:lastRow="0" w:firstColumn="1" w:lastColumn="0" w:noHBand="0" w:noVBand="1"/>
-    </w:tblPr>
-    <w:tblGrid>
-      <w:gridCol w:w="4680"/>
-      <w:gridCol w:w="390"/>
-      <w:gridCol w:w="4676"/>
-    </w:tblGrid>
-    <w:tr>
-      <w:tc>
-        <w:tcPr>
-          <w:tcW w:w="2401" w:type="pct"/>
-        </w:tcPr>
-        <w:p>
-          <w:pPr>
-            <w:pStyle w:val="a8"/>
-            <w:rPr>
-              <w:caps/>
-              <w:color w:val="4472C4"/>
-              <w:sz w:val="18"/>
-              <w:szCs w:val="18"/>
-            </w:rPr>
-          </w:pPr>
-          <w:r>
-            <w:rPr>
-              <w:caps/>
-              <w:color w:val="4472C4"/>
-              <w:sz w:val="18"/>
-              <w:szCs w:val="18"/>
-            </w:rPr>
-            <w:t>[Document title]</w:t>
-          </w:r>
-        </w:p>
-      </w:tc>
-      <w:tc>
-        <w:tcPr>
-          <w:tcW w:w="200" w:type="pct"/>
-        </w:tcPr>
-        <w:p>
-          <w:pPr>
-            <w:pStyle w:val="a8"/>
-            <w:rPr>
-              <w:caps/>
-              <w:color w:val="4472C4"/>
-              <w:sz w:val="18"/>
-              <w:szCs w:val="18"/>
-            </w:rPr>
-          </w:pPr>
-        </w:p>
-      </w:tc>
-      <w:tc>
-        <w:tcPr>
-          <w:tcW w:w="2402" w:type="pct"/>
-        </w:tcPr>
-        <w:p>
-          <w:pPr>
-            <w:pStyle w:val="a8"/>
-            <w:jc w:val="right"/>
-            <w:rPr>
-              <w:caps/>
-              <w:color w:val="4472C4"/>
-              <w:sz w:val="18"/>
-              <w:szCs w:val="18"/>
-            </w:rPr>
-          </w:pPr>
-          <w:r>
-            <w:rPr>
-              <w:caps/>
-              <w:color w:val="4472C4"/>
-              <w:sz w:val="18"/>
-              <w:szCs w:val="18"/>
-            </w:rPr>
-            <w:t>[Author name]</w:t>
-          </w:r>
-        </w:p>
-      </w:tc>
-    </w:tr>
-  </w:tbl>
   <w:p>
     <w:pPr>
       <w:pStyle w:val="a8"/>
-      <w:rPr>
-        <w:rFonts w:ascii="Calibri" w:hAnsi="Calibri" w:cs="Calibri"/>
-        <w:color w:val="A6A6A6"/>
-        <w:sz w:val="18"/>
-        <w:szCs w:val="18"/>
-      </w:rPr>
     </w:pPr>
   </w:p>
 </w:ftr>
 </file>
 
 <file path=word/footer2.xml><?xml version="1.0" encoding="utf-8"?>
+<w:ftr xmlns:wpc="http://schemas.microsoft.com/office/word/2010/wordprocessingCanvas" xmlns:cx="http://schemas.microsoft.com/office/drawing/2014/chartex" xmlns:cx1="http://schemas.microsoft.com/office/drawing/2015/9/8/chartex" xmlns:cx2="http://schemas.microsoft.com/office/drawing/2015/10/21/chartex" xmlns:cx3="http://schemas.microsoft.com/office/drawing/2016/5/9/chartex" xmlns:cx4="http://schemas.microsoft.com/office/drawing/2016/5/10/chartex" xmlns:cx5="http://schemas.microsoft.com/office/drawing/2016/5/11/chartex" xmlns:cx6="http://schemas.microsoft.com/office/drawing/2016/5/12/chartex" xmlns:cx7="http://schemas.microsoft.com/office/drawing/2016/5/13/chartex" xmlns:cx8="http://schemas.microsoft.com/office/drawing/2016/5/14/chartex" xmlns:mc="http://schemas.openxmlformats.org/markup-compatibility/2006" xmlns:aink="http://schemas.microsoft.com/office/drawing/2016/ink" xmlns:am3d="http://schemas.microsoft.com/office/drawing/2017/model3d" xmlns:o="urn:schemas-microsoft-com:office:office" xmlns:oel="http://schemas.microsoft.com/office/2019/extlst" xmlns:r="http://schemas.openxmlformats.org/officeDocument/2006/relationships" xmlns:m="http://schemas.openxmlformats.org/officeDocument/2006/math" xmlns:v="urn:schemas-microsoft-com:vml" xmlns:wp14="http://schemas.microsoft.com/office/word/2010/wordprocessingDrawing" xmlns:wp="http://schemas.openxmlformats.org/drawingml/2006/wordprocessingDrawing" xmlns:w10="urn:schemas-microsoft-com:office:word" xmlns:w="http://schemas.openxmlformats.org/wordprocessingml/2006/main" xmlns:w14="http://schemas.microsoft.com/office/word/2010/wordml" xmlns:w15="http://schemas.microsoft.com/office/word/2012/wordml" xmlns:w16cex="http://schemas.microsoft.com/office/word/2018/wordml/cex" xmlns:w16cid="http://schemas.microsoft.com/office/word/2016/wordml/cid" xmlns:w16="http://schemas.microsoft.com/office/word/2018/wordml" xmlns:w16du="http://schemas.microsoft.com/office/word/2023/wordml/word16du" xmlns:w16sdtdh="http://schemas.microsoft.com/office/word/2020/wordml/sdtdatahash" xmlns:w16sdtfl="http://schemas.microsoft.com/office/word/2024/wordml/sdtformatlock" xmlns:w16se="http://schemas.microsoft.com/office/word/2015/wordml/symex" xmlns:wpg="http://schemas.microsoft.com/office/word/2010/wordprocessingGroup" xmlns:wpi="http://schemas.microsoft.com/office/word/2010/wordprocessingInk" xmlns:wne="http://schemas.microsoft.com/office/word/2006/wordml" xmlns:wps="http://schemas.microsoft.com/office/word/2010/wordprocessingShape" mc:Ignorable="w14 w15 w16se w16cid w16 w16cex w16sdtdh w16sdtfl w16du wp14">
+  <w:p>
+    <w:pPr>
+      <w:pStyle w:val="a8"/>
+      <w:rPr>
+        <w:caps/>
+        <w:color w:val="4472C4"/>
+        <w:sz w:val="18"/>
+        <w:szCs w:val="18"/>
+      </w:rPr>
+    </w:pPr>
+    <w:r>
+      <w:rPr>
+        <w:caps/>
+        <w:color w:val="4472C4"/>
+        <w:sz w:val="18"/>
+        <w:szCs w:val="18"/>
+      </w:rPr>
+      <w:t>IN6227 Assignment 1, Variant 2: Tabular Classification SKILL</w:t>
+    </w:r>
+  </w:p>
+  <w:p>
+    <w:pPr>
+      <w:pStyle w:val="a8"/>
+      <w:rPr>
+        <w:caps/>
+        <w:color w:val="4472C4"/>
+        <w:sz w:val="18"/>
+        <w:szCs w:val="18"/>
+      </w:rPr>
+    </w:pPr>
+  </w:p>
+  <w:p>
+    <w:pPr>
+      <w:pStyle w:val="a8"/>
+      <w:rPr>
+        <w:caps/>
+        <w:color w:val="4472C4"/>
+        <w:sz w:val="18"/>
+        <w:szCs w:val="18"/>
+      </w:rPr>
+    </w:pPr>
+    <w:r>
+      <w:rPr>
+        <w:caps/>
+        <w:color w:val="4472C4"/>
+        <w:sz w:val="18"/>
+        <w:szCs w:val="18"/>
+      </w:rPr>
+      <w:t>LIN TONG, G2608825L</w:t>
+    </w:r>
+  </w:p>
+  <w:p>
+    <w:pPr>
+      <w:pStyle w:val="a8"/>
+      <w:rPr>
+        <w:caps/>
+        <w:color w:val="4472C4"/>
+        <w:sz w:val="18"/>
+        <w:szCs w:val="18"/>
+      </w:rPr>
+    </w:pPr>
+  </w:p>
+  <w:p>
+    <w:pPr>
+      <w:pStyle w:val="a8"/>
+      <w:rPr>
+        <w:caps/>
+        <w:color w:val="4472C4"/>
+        <w:sz w:val="18"/>
+        <w:szCs w:val="18"/>
+      </w:rPr>
+    </w:pPr>
+  </w:p>
+  <w:p>
+    <w:pPr>
+      <w:pStyle w:val="a8"/>
+      <w:rPr>
+        <w:rFonts w:ascii="Calibri" w:hAnsi="Calibri" w:cs="Calibri"/>
+        <w:color w:val="A6A6A6"/>
+        <w:sz w:val="18"/>
+        <w:szCs w:val="18"/>
+      </w:rPr>
+    </w:pPr>
+  </w:p>
+</w:ftr>
+</file>
+
+<file path=word/footer3.xml><?xml version="1.0" encoding="utf-8"?>
 <w:ftr xmlns:wpc="http://schemas.microsoft.com/office/word/2010/wordprocessingCanvas" xmlns:cx="http://schemas.microsoft.com/office/drawing/2014/chartex" xmlns:cx1="http://schemas.microsoft.com/office/drawing/2015/9/8/chartex" xmlns:cx2="http://schemas.microsoft.com/office/drawing/2015/10/21/chartex" xmlns:cx3="http://schemas.microsoft.com/office/drawing/2016/5/9/chartex" xmlns:cx4="http://schemas.microsoft.com/office/drawing/2016/5/10/chartex" xmlns:cx5="http://schemas.microsoft.com/office/drawing/2016/5/11/chartex" xmlns:cx6="http://schemas.microsoft.com/office/drawing/2016/5/12/chartex" xmlns:cx7="http://schemas.microsoft.com/office/drawing/2016/5/13/chartex" xmlns:cx8="http://schemas.microsoft.com/office/drawing/2016/5/14/chartex" xmlns:mc="http://schemas.openxmlformats.org/markup-compatibility/2006" xmlns:aink="http://schemas.microsoft.com/office/drawing/2016/ink" xmlns:am3d="http://schemas.microsoft.com/office/drawing/2017/model3d" xmlns:o="urn:schemas-microsoft-com:office:office" xmlns:oel="http://schemas.microsoft.com/office/2019/extlst" xmlns:r="http://schemas.openxmlformats.org/officeDocument/2006/relationships" xmlns:m="http://schemas.openxmlformats.org/officeDocument/2006/math" xmlns:v="urn:schemas-microsoft-com:vml" xmlns:wp14="http://schemas.microsoft.com/office/word/2010/wordprocessingDrawing" xmlns:wp="http://schemas.openxmlformats.org/drawingml/2006/wordprocessingDrawing" xmlns:w10="urn:schemas-microsoft-com:office:word" xmlns:w="http://schemas.openxmlformats.org/wordprocessingml/2006/main" xmlns:w14="http://schemas.microsoft.com/office/word/2010/wordml" xmlns:w15="http://schemas.microsoft.com/office/word/2012/wordml" xmlns:w16cex="http://schemas.microsoft.com/office/word/2018/wordml/cex" xmlns:w16cid="http://schemas.microsoft.com/office/word/2016/wordml/cid" xmlns:w16="http://schemas.microsoft.com/office/word/2018/wordml" xmlns:w16du="http://schemas.microsoft.com/office/word/2023/wordml/word16du" xmlns:w16sdtdh="http://schemas.microsoft.com/office/word/2020/wordml/sdtdatahash" xmlns:w16sdtfl="http://schemas.microsoft.com/office/word/2024/wordml/sdtformatlock" xmlns:w16se="http://schemas.microsoft.com/office/word/2015/wordml/symex" xmlns:wpg="http://schemas.microsoft.com/office/word/2010/wordprocessingGroup" xmlns:wpi="http://schemas.microsoft.com/office/word/2010/wordprocessingInk" xmlns:wne="http://schemas.microsoft.com/office/word/2006/wordml" xmlns:wps="http://schemas.microsoft.com/office/word/2010/wordprocessingShape" mc:Ignorable="w14 w15 w16se w16cid w16 w16cex w16sdtdh w16sdtfl w16du wp14">
   <w:p>
     <w:pPr>
@@ -4534,10 +4543,10 @@
       </w:rPr>
     </w:lvl>
   </w:abstractNum>
-  <w:num w:numId="1" w16cid:durableId="1700426547">
+  <w:num w:numId="1" w16cid:durableId="1240292431">
     <w:abstractNumId w:val="28"/>
   </w:num>
-  <w:num w:numId="2" w16cid:durableId="825821413">
+  <w:num w:numId="2" w16cid:durableId="503937633">
     <w:abstractNumId w:val="1"/>
     <w:lvlOverride w:ilvl="0">
       <w:lvl w:ilvl="0">
@@ -4555,13 +4564,13 @@
       </w:lvl>
     </w:lvlOverride>
   </w:num>
-  <w:num w:numId="3" w16cid:durableId="1768303967">
+  <w:num w:numId="3" w16cid:durableId="1021511193">
     <w:abstractNumId w:val="39"/>
   </w:num>
-  <w:num w:numId="4" w16cid:durableId="1532642643">
+  <w:num w:numId="4" w16cid:durableId="541290674">
     <w:abstractNumId w:val="5"/>
   </w:num>
-  <w:num w:numId="5" w16cid:durableId="833179846">
+  <w:num w:numId="5" w16cid:durableId="1029913189">
     <w:abstractNumId w:val="1"/>
     <w:lvlOverride w:ilvl="0">
       <w:lvl w:ilvl="0">
@@ -4579,34 +4588,34 @@
       </w:lvl>
     </w:lvlOverride>
   </w:num>
-  <w:num w:numId="6" w16cid:durableId="203686885">
+  <w:num w:numId="6" w16cid:durableId="1774547549">
     <w:abstractNumId w:val="16"/>
   </w:num>
-  <w:num w:numId="7" w16cid:durableId="137110773">
+  <w:num w:numId="7" w16cid:durableId="725109276">
     <w:abstractNumId w:val="23"/>
   </w:num>
-  <w:num w:numId="8" w16cid:durableId="263154820">
+  <w:num w:numId="8" w16cid:durableId="1573656788">
     <w:abstractNumId w:val="36"/>
   </w:num>
-  <w:num w:numId="9" w16cid:durableId="1096749562">
+  <w:num w:numId="9" w16cid:durableId="812989465">
     <w:abstractNumId w:val="11"/>
   </w:num>
-  <w:num w:numId="10" w16cid:durableId="1446195239">
+  <w:num w:numId="10" w16cid:durableId="1314796831">
     <w:abstractNumId w:val="18"/>
   </w:num>
-  <w:num w:numId="11" w16cid:durableId="43801513">
+  <w:num w:numId="11" w16cid:durableId="614094127">
     <w:abstractNumId w:val="10"/>
   </w:num>
-  <w:num w:numId="12" w16cid:durableId="1039935467">
+  <w:num w:numId="12" w16cid:durableId="780994937">
     <w:abstractNumId w:val="9"/>
   </w:num>
-  <w:num w:numId="13" w16cid:durableId="586765658">
+  <w:num w:numId="13" w16cid:durableId="499196056">
     <w:abstractNumId w:val="0"/>
   </w:num>
-  <w:num w:numId="14" w16cid:durableId="783767381">
+  <w:num w:numId="14" w16cid:durableId="362366143">
     <w:abstractNumId w:val="17"/>
   </w:num>
-  <w:num w:numId="15" w16cid:durableId="649945203">
+  <w:num w:numId="15" w16cid:durableId="537546182">
     <w:abstractNumId w:val="17"/>
     <w:lvlOverride w:ilvl="0">
       <w:lvl w:ilvl="0">
@@ -4621,10 +4630,10 @@
       </w:lvl>
     </w:lvlOverride>
   </w:num>
-  <w:num w:numId="16" w16cid:durableId="1617446351">
+  <w:num w:numId="16" w16cid:durableId="1678576149">
     <w:abstractNumId w:val="24"/>
   </w:num>
-  <w:num w:numId="17" w16cid:durableId="1781994410">
+  <w:num w:numId="17" w16cid:durableId="2031031536">
     <w:abstractNumId w:val="24"/>
     <w:lvlOverride w:ilvl="0">
       <w:lvl w:ilvl="0">
@@ -4639,85 +4648,85 @@
       </w:lvl>
     </w:lvlOverride>
   </w:num>
-  <w:num w:numId="18" w16cid:durableId="171145468">
+  <w:num w:numId="18" w16cid:durableId="1856461252">
     <w:abstractNumId w:val="19"/>
   </w:num>
-  <w:num w:numId="19" w16cid:durableId="642126771">
+  <w:num w:numId="19" w16cid:durableId="2082941187">
     <w:abstractNumId w:val="12"/>
   </w:num>
-  <w:num w:numId="20" w16cid:durableId="1945920253">
+  <w:num w:numId="20" w16cid:durableId="197663387">
     <w:abstractNumId w:val="30"/>
   </w:num>
-  <w:num w:numId="21" w16cid:durableId="1099175352">
+  <w:num w:numId="21" w16cid:durableId="1634169292">
     <w:abstractNumId w:val="25"/>
   </w:num>
-  <w:num w:numId="22" w16cid:durableId="1472475955">
+  <w:num w:numId="22" w16cid:durableId="1778670316">
     <w:abstractNumId w:val="37"/>
   </w:num>
-  <w:num w:numId="23" w16cid:durableId="1847016493">
+  <w:num w:numId="23" w16cid:durableId="1558274429">
     <w:abstractNumId w:val="14"/>
   </w:num>
-  <w:num w:numId="24" w16cid:durableId="1184784581">
+  <w:num w:numId="24" w16cid:durableId="1299989843">
     <w:abstractNumId w:val="13"/>
   </w:num>
-  <w:num w:numId="25" w16cid:durableId="553926351">
+  <w:num w:numId="25" w16cid:durableId="977339963">
     <w:abstractNumId w:val="35"/>
   </w:num>
-  <w:num w:numId="26" w16cid:durableId="1516337383">
+  <w:num w:numId="26" w16cid:durableId="812482356">
     <w:abstractNumId w:val="20"/>
   </w:num>
-  <w:num w:numId="27" w16cid:durableId="2097169850">
+  <w:num w:numId="27" w16cid:durableId="1003506737">
     <w:abstractNumId w:val="32"/>
   </w:num>
-  <w:num w:numId="28" w16cid:durableId="1153251848">
+  <w:num w:numId="28" w16cid:durableId="1269507398">
     <w:abstractNumId w:val="4"/>
   </w:num>
-  <w:num w:numId="29" w16cid:durableId="276564476">
+  <w:num w:numId="29" w16cid:durableId="659429497">
     <w:abstractNumId w:val="2"/>
   </w:num>
-  <w:num w:numId="30" w16cid:durableId="679771914">
+  <w:num w:numId="30" w16cid:durableId="446241955">
     <w:abstractNumId w:val="6"/>
   </w:num>
-  <w:num w:numId="31" w16cid:durableId="1957180510">
+  <w:num w:numId="31" w16cid:durableId="1169710370">
     <w:abstractNumId w:val="21"/>
   </w:num>
-  <w:num w:numId="32" w16cid:durableId="953436664">
+  <w:num w:numId="32" w16cid:durableId="506137635">
     <w:abstractNumId w:val="38"/>
   </w:num>
-  <w:num w:numId="33" w16cid:durableId="64382600">
+  <w:num w:numId="33" w16cid:durableId="1602566961">
     <w:abstractNumId w:val="27"/>
   </w:num>
-  <w:num w:numId="34" w16cid:durableId="867261535">
+  <w:num w:numId="34" w16cid:durableId="277495753">
     <w:abstractNumId w:val="22"/>
   </w:num>
-  <w:num w:numId="35" w16cid:durableId="58092489">
+  <w:num w:numId="35" w16cid:durableId="1391919566">
     <w:abstractNumId w:val="31"/>
   </w:num>
-  <w:num w:numId="36" w16cid:durableId="1091438981">
+  <w:num w:numId="36" w16cid:durableId="1653749535">
     <w:abstractNumId w:val="33"/>
   </w:num>
-  <w:num w:numId="37" w16cid:durableId="1500344268">
+  <w:num w:numId="37" w16cid:durableId="1509715787">
     <w:abstractNumId w:val="7"/>
   </w:num>
-  <w:num w:numId="38" w16cid:durableId="677585359">
+  <w:num w:numId="38" w16cid:durableId="1313145294">
     <w:abstractNumId w:val="8"/>
   </w:num>
-  <w:num w:numId="39" w16cid:durableId="1039475758">
+  <w:num w:numId="39" w16cid:durableId="1735467016">
     <w:abstractNumId w:val="15"/>
   </w:num>
-  <w:num w:numId="40" w16cid:durableId="1057969638">
+  <w:num w:numId="40" w16cid:durableId="2030250532">
     <w:abstractNumId w:val="34"/>
   </w:num>
-  <w:num w:numId="41" w16cid:durableId="730345416">
+  <w:num w:numId="41" w16cid:durableId="1779635888">
     <w:abstractNumId w:val="29"/>
   </w:num>
-  <w:num w:numId="42" w16cid:durableId="1452818702">
+  <w:num w:numId="42" w16cid:durableId="276183597">
     <w:abstractNumId w:val="3"/>
   </w:num>
-  <w:num w:numId="43" w16cid:durableId="1706321996">
+  <w:num w:numId="43" w16cid:durableId="237177066">
     <w:abstractNumId w:val="40"/>
   </w:num>
-  <w:num w:numId="44" w16cid:durableId="199129414">
+  <w:num w:numId="44" w16cid:durableId="468478799">
     <w:abstractNumId w:val="26"/>
   </w:num>
 </w:numbering>

</xml_diff>

<commit_message>
Match official template: two-column layout, compact table, small image, proper footer, metadata in VITA only
</commit_message>
<xml_diff>
--- a/report_filled.docx
+++ b/report_filled.docx
@@ -129,8 +129,20 @@
     <w:p>
       <w:pPr>
         <w:pStyle w:val="PARAGRAPHnoindent"/>
+        <w:rPr>
+          <w:rFonts w:ascii="Times New Roman" w:hAnsi="Times New Roman"/>
+          <w:color w:val="000000"/>
+          <w:sz w:val="20"/>
+          <w:lang w:val="en-GB"/>
+        </w:rPr>
       </w:pPr>
       <w:r>
+        <w:rPr>
+          <w:rFonts w:ascii="Times New Roman" w:hAnsi="Times New Roman"/>
+          <w:color w:val="000000"/>
+          <w:sz w:val="20"/>
+          <w:lang w:val="en-GB"/>
+        </w:rPr>
         <w:t>This report presents an end-to-end tabular classification workflow applied to the dataset (31112 rows, 15 features). The target variable is label with 2 classes: no, yes. Class distribution (train): no=23645, yes=7464, imbalance ratio 3.168:1. The data contains 50 missing values. Column types: 7 numeric, 8 categorical. The goal is to build a leakage-safe, reproducible classification pipeline and compare multiple models.</w:t>
       </w:r>
     </w:p>
@@ -192,8 +204,20 @@
     <w:p>
       <w:pPr>
         <w:pStyle w:val="PARAGRAPHnoindent"/>
+        <w:rPr>
+          <w:rFonts w:ascii="Times New Roman" w:hAnsi="Times New Roman"/>
+          <w:color w:val="000000"/>
+          <w:sz w:val="20"/>
+          <w:lang w:val="en-GB"/>
+        </w:rPr>
       </w:pPr>
       <w:r>
+        <w:rPr>
+          <w:rFonts w:ascii="Times New Roman" w:hAnsi="Times New Roman"/>
+          <w:color w:val="000000"/>
+          <w:sz w:val="20"/>
+          <w:lang w:val="en-GB"/>
+        </w:rPr>
         <w:t>All learned preprocessing (median imputation for numerics, most-frequent imputation and one-hot encoding for categorics, standard scaling) is embedded inside sklearn Pipeline / ColumnTransformer, so during cross-validation the imputer, scaler, and encoder are refit on each training fold only. No manual feature selection is applied. Four classifiers are trained: DummyClassifier (stratified baseline), LogisticRegression (max_iter=1000, class_weight=balanced), RandomForest (n_estimators=200, class_weight=balanced), and GradientBoosting (n_estimators=100, max_depth=3). Cross-validation uses Stratified 5-fold (random_state=42). Model selection uses mean CV F1. The best model is retrained on the full training set and evaluated once on the held-out test set.</w:t>
       </w:r>
     </w:p>
@@ -241,28 +265,618 @@
     </w:p>
     <w:p>
       <w:pPr>
-        <w:pStyle w:val="PARAGRAPHnoindent"/>
-      </w:pPr>
-      <w:r>
-        <w:t>Cross-validation results (5-fold, stratified):</w:t>
-      </w:r>
-    </w:p>
-    <w:p>
-      <w:pPr>
         <w:pStyle w:val="PARAGRAPH"/>
         <w:ind w:firstLine="0"/>
+        <w:rPr>
+          <w:rFonts w:ascii="Times New Roman" w:hAnsi="Times New Roman"/>
+          <w:sz w:val="20"/>
+          <w:lang w:val="en-GB"/>
+        </w:rPr>
+      </w:pPr>
+      <w:r>
         <w:rPr>
           <w:rFonts w:ascii="Times New Roman" w:hAnsi="Times New Roman"/>
           <w:color w:val="000000"/>
           <w:sz w:val="20"/>
           <w:lang w:val="en-GB"/>
         </w:rPr>
+        <w:t>Test-set performance (best model: random_forest): accuracy=0.8272, precision=0.6177, recall=0.7156, F1=0.6631, ROC-AUC=0.8887, PR-AUC=0.7010.</w:t>
+      </w:r>
+    </w:p>
+    <w:tbl>
+      <w:tblPr>
+        <w:tblW w:w="4600" w:type="dxa"/>
+        <w:tblBorders>
+          <w:top w:val="single" w:sz="4" w:space="0" w:color="auto"/>
+          <w:left w:val="single" w:sz="4" w:space="0" w:color="auto"/>
+          <w:bottom w:val="single" w:sz="4" w:space="0" w:color="auto"/>
+          <w:right w:val="single" w:sz="4" w:space="0" w:color="auto"/>
+          <w:insideH w:val="single" w:sz="4" w:space="0" w:color="auto"/>
+          <w:insideV w:val="single" w:sz="4" w:space="0" w:color="auto"/>
+        </w:tblBorders>
+        <w:tblLayout w:type="fixed"/>
+        <w:tblLook w:val="0000" w:firstRow="0" w:lastRow="0" w:firstColumn="0" w:lastColumn="0" w:noHBand="0" w:noVBand="0"/>
+      </w:tblPr>
+      <w:tblGrid>
+        <w:gridCol w:w="1600"/>
+        <w:gridCol w:w="1000"/>
+        <w:gridCol w:w="1000"/>
+        <w:gridCol w:w="1000"/>
+      </w:tblGrid>
+      <w:tr>
+        <w:tblPrEx>
+          <w:tblCellMar>
+            <w:top w:w="0" w:type="dxa"/>
+            <w:bottom w:w="0" w:type="dxa"/>
+          </w:tblCellMar>
+        </w:tblPrEx>
+        <w:tc>
+          <w:tcPr>
+            <w:tcW w:w="1600" w:type="dxa"/>
+          </w:tcPr>
+          <w:p>
+            <w:pPr>
+              <w:pStyle w:val="PARAGRAPH"/>
+              <w:ind w:firstLine="0"/>
+              <w:rPr>
+                <w:rFonts w:ascii="Times New Roman" w:hAnsi="Times New Roman"/>
+                <w:b/>
+                <w:sz w:val="18"/>
+                <w:lang w:val="en-GB"/>
+              </w:rPr>
+            </w:pPr>
+            <w:r>
+              <w:rPr>
+                <w:rFonts w:ascii="Times New Roman" w:hAnsi="Times New Roman"/>
+                <w:b/>
+                <w:sz w:val="18"/>
+                <w:lang w:val="en-GB"/>
+              </w:rPr>
+              <w:t>Model</w:t>
+            </w:r>
+          </w:p>
+        </w:tc>
+        <w:tc>
+          <w:tcPr>
+            <w:tcW w:w="1000" w:type="dxa"/>
+          </w:tcPr>
+          <w:p>
+            <w:pPr>
+              <w:pStyle w:val="PARAGRAPH"/>
+              <w:ind w:firstLine="0"/>
+              <w:rPr>
+                <w:rFonts w:ascii="Times New Roman" w:hAnsi="Times New Roman"/>
+                <w:b/>
+                <w:sz w:val="18"/>
+                <w:lang w:val="en-GB"/>
+              </w:rPr>
+            </w:pPr>
+            <w:r>
+              <w:rPr>
+                <w:rFonts w:ascii="Times New Roman" w:hAnsi="Times New Roman"/>
+                <w:b/>
+                <w:sz w:val="18"/>
+                <w:lang w:val="en-GB"/>
+              </w:rPr>
+              <w:t>Acc</w:t>
+            </w:r>
+          </w:p>
+        </w:tc>
+        <w:tc>
+          <w:tcPr>
+            <w:tcW w:w="1000" w:type="dxa"/>
+          </w:tcPr>
+          <w:p>
+            <w:pPr>
+              <w:pStyle w:val="PARAGRAPH"/>
+              <w:ind w:firstLine="0"/>
+              <w:rPr>
+                <w:rFonts w:ascii="Times New Roman" w:hAnsi="Times New Roman"/>
+                <w:b/>
+                <w:sz w:val="18"/>
+                <w:lang w:val="en-GB"/>
+              </w:rPr>
+            </w:pPr>
+            <w:r>
+              <w:rPr>
+                <w:rFonts w:ascii="Times New Roman" w:hAnsi="Times New Roman"/>
+                <w:b/>
+                <w:sz w:val="18"/>
+                <w:lang w:val="en-GB"/>
+              </w:rPr>
+              <w:t>F1</w:t>
+            </w:r>
+          </w:p>
+        </w:tc>
+        <w:tc>
+          <w:tcPr>
+            <w:tcW w:w="1000" w:type="dxa"/>
+          </w:tcPr>
+          <w:p>
+            <w:pPr>
+              <w:pStyle w:val="PARAGRAPH"/>
+              <w:ind w:firstLine="0"/>
+              <w:rPr>
+                <w:rFonts w:ascii="Times New Roman" w:hAnsi="Times New Roman"/>
+                <w:b/>
+                <w:sz w:val="18"/>
+                <w:lang w:val="en-GB"/>
+              </w:rPr>
+            </w:pPr>
+            <w:r>
+              <w:rPr>
+                <w:rFonts w:ascii="Times New Roman" w:hAnsi="Times New Roman"/>
+                <w:b/>
+                <w:sz w:val="18"/>
+                <w:lang w:val="en-GB"/>
+              </w:rPr>
+              <w:t>AUC</w:t>
+            </w:r>
+          </w:p>
+        </w:tc>
+      </w:tr>
+      <w:tr>
+        <w:tblPrEx>
+          <w:tblCellMar>
+            <w:top w:w="0" w:type="dxa"/>
+            <w:bottom w:w="0" w:type="dxa"/>
+          </w:tblCellMar>
+        </w:tblPrEx>
+        <w:tc>
+          <w:tcPr>
+            <w:tcW w:w="1600" w:type="dxa"/>
+          </w:tcPr>
+          <w:p>
+            <w:pPr>
+              <w:pStyle w:val="PARAGRAPH"/>
+              <w:ind w:firstLine="0"/>
+              <w:rPr>
+                <w:rFonts w:ascii="Times New Roman" w:hAnsi="Times New Roman"/>
+                <w:sz w:val="18"/>
+                <w:lang w:val="en-GB"/>
+              </w:rPr>
+            </w:pPr>
+            <w:r>
+              <w:rPr>
+                <w:rFonts w:ascii="Times New Roman" w:hAnsi="Times New Roman"/>
+                <w:sz w:val="18"/>
+                <w:lang w:val="en-GB"/>
+              </w:rPr>
+              <w:t>dummy</w:t>
+            </w:r>
+          </w:p>
+        </w:tc>
+        <w:tc>
+          <w:tcPr>
+            <w:tcW w:w="1000" w:type="dxa"/>
+          </w:tcPr>
+          <w:p>
+            <w:pPr>
+              <w:pStyle w:val="PARAGRAPH"/>
+              <w:ind w:firstLine="0"/>
+              <w:rPr>
+                <w:rFonts w:ascii="Times New Roman" w:hAnsi="Times New Roman"/>
+                <w:sz w:val="18"/>
+                <w:lang w:val="en-GB"/>
+              </w:rPr>
+            </w:pPr>
+            <w:r>
+              <w:rPr>
+                <w:rFonts w:ascii="Times New Roman" w:hAnsi="Times New Roman"/>
+                <w:sz w:val="18"/>
+                <w:lang w:val="en-GB"/>
+              </w:rPr>
+              <w:t>0.635</w:t>
+            </w:r>
+          </w:p>
+        </w:tc>
+        <w:tc>
+          <w:tcPr>
+            <w:tcW w:w="1000" w:type="dxa"/>
+          </w:tcPr>
+          <w:p>
+            <w:pPr>
+              <w:pStyle w:val="PARAGRAPH"/>
+              <w:ind w:firstLine="0"/>
+              <w:rPr>
+                <w:rFonts w:ascii="Times New Roman" w:hAnsi="Times New Roman"/>
+                <w:sz w:val="18"/>
+                <w:lang w:val="en-GB"/>
+              </w:rPr>
+            </w:pPr>
+            <w:r>
+              <w:rPr>
+                <w:rFonts w:ascii="Times New Roman" w:hAnsi="Times New Roman"/>
+                <w:sz w:val="18"/>
+                <w:lang w:val="en-GB"/>
+              </w:rPr>
+              <w:t>0.235</w:t>
+            </w:r>
+          </w:p>
+        </w:tc>
+        <w:tc>
+          <w:tcPr>
+            <w:tcW w:w="1000" w:type="dxa"/>
+          </w:tcPr>
+          <w:p>
+            <w:pPr>
+              <w:pStyle w:val="PARAGRAPH"/>
+              <w:ind w:firstLine="0"/>
+              <w:rPr>
+                <w:rFonts w:ascii="Times New Roman" w:hAnsi="Times New Roman"/>
+                <w:sz w:val="18"/>
+                <w:lang w:val="en-GB"/>
+              </w:rPr>
+            </w:pPr>
+            <w:r>
+              <w:rPr>
+                <w:rFonts w:ascii="Times New Roman" w:hAnsi="Times New Roman"/>
+                <w:sz w:val="18"/>
+                <w:lang w:val="en-GB"/>
+              </w:rPr>
+              <w:t>0.498</w:t>
+            </w:r>
+          </w:p>
+        </w:tc>
+      </w:tr>
+      <w:tr>
+        <w:tblPrEx>
+          <w:tblCellMar>
+            <w:top w:w="0" w:type="dxa"/>
+            <w:bottom w:w="0" w:type="dxa"/>
+          </w:tblCellMar>
+        </w:tblPrEx>
+        <w:tc>
+          <w:tcPr>
+            <w:tcW w:w="1600" w:type="dxa"/>
+          </w:tcPr>
+          <w:p>
+            <w:pPr>
+              <w:pStyle w:val="PARAGRAPH"/>
+              <w:ind w:firstLine="0"/>
+              <w:rPr>
+                <w:rFonts w:ascii="Times New Roman" w:hAnsi="Times New Roman"/>
+                <w:sz w:val="18"/>
+                <w:lang w:val="en-GB"/>
+              </w:rPr>
+            </w:pPr>
+            <w:r>
+              <w:rPr>
+                <w:rFonts w:ascii="Times New Roman" w:hAnsi="Times New Roman"/>
+                <w:sz w:val="18"/>
+                <w:lang w:val="en-GB"/>
+              </w:rPr>
+              <w:t>log_reg</w:t>
+            </w:r>
+          </w:p>
+        </w:tc>
+        <w:tc>
+          <w:tcPr>
+            <w:tcW w:w="1000" w:type="dxa"/>
+          </w:tcPr>
+          <w:p>
+            <w:pPr>
+              <w:pStyle w:val="PARAGRAPH"/>
+              <w:ind w:firstLine="0"/>
+              <w:rPr>
+                <w:rFonts w:ascii="Times New Roman" w:hAnsi="Times New Roman"/>
+                <w:sz w:val="18"/>
+                <w:lang w:val="en-GB"/>
+              </w:rPr>
+            </w:pPr>
+            <w:r>
+              <w:rPr>
+                <w:rFonts w:ascii="Times New Roman" w:hAnsi="Times New Roman"/>
+                <w:sz w:val="18"/>
+                <w:lang w:val="en-GB"/>
+              </w:rPr>
+              <w:t>0.790</w:t>
+            </w:r>
+          </w:p>
+        </w:tc>
+        <w:tc>
+          <w:tcPr>
+            <w:tcW w:w="1000" w:type="dxa"/>
+          </w:tcPr>
+          <w:p>
+            <w:pPr>
+              <w:pStyle w:val="PARAGRAPH"/>
+              <w:ind w:firstLine="0"/>
+              <w:rPr>
+                <w:rFonts w:ascii="Times New Roman" w:hAnsi="Times New Roman"/>
+                <w:sz w:val="18"/>
+                <w:lang w:val="en-GB"/>
+              </w:rPr>
+            </w:pPr>
+            <w:r>
+              <w:rPr>
+                <w:rFonts w:ascii="Times New Roman" w:hAnsi="Times New Roman"/>
+                <w:sz w:val="18"/>
+                <w:lang w:val="en-GB"/>
+              </w:rPr>
+              <w:t>0.660</w:t>
+            </w:r>
+          </w:p>
+        </w:tc>
+        <w:tc>
+          <w:tcPr>
+            <w:tcW w:w="1000" w:type="dxa"/>
+          </w:tcPr>
+          <w:p>
+            <w:pPr>
+              <w:pStyle w:val="PARAGRAPH"/>
+              <w:ind w:firstLine="0"/>
+              <w:rPr>
+                <w:rFonts w:ascii="Times New Roman" w:hAnsi="Times New Roman"/>
+                <w:sz w:val="18"/>
+                <w:lang w:val="en-GB"/>
+              </w:rPr>
+            </w:pPr>
+            <w:r>
+              <w:rPr>
+                <w:rFonts w:ascii="Times New Roman" w:hAnsi="Times New Roman"/>
+                <w:sz w:val="18"/>
+                <w:lang w:val="en-GB"/>
+              </w:rPr>
+              <w:t>0.890</w:t>
+            </w:r>
+          </w:p>
+        </w:tc>
+      </w:tr>
+      <w:tr>
+        <w:tblPrEx>
+          <w:tblCellMar>
+            <w:top w:w="0" w:type="dxa"/>
+            <w:bottom w:w="0" w:type="dxa"/>
+          </w:tblCellMar>
+        </w:tblPrEx>
+        <w:tc>
+          <w:tcPr>
+            <w:tcW w:w="1600" w:type="dxa"/>
+          </w:tcPr>
+          <w:p>
+            <w:pPr>
+              <w:pStyle w:val="PARAGRAPH"/>
+              <w:ind w:firstLine="0"/>
+              <w:rPr>
+                <w:rFonts w:ascii="Times New Roman" w:hAnsi="Times New Roman"/>
+                <w:sz w:val="18"/>
+                <w:lang w:val="en-GB"/>
+              </w:rPr>
+            </w:pPr>
+            <w:r>
+              <w:rPr>
+                <w:rFonts w:ascii="Times New Roman" w:hAnsi="Times New Roman"/>
+                <w:sz w:val="18"/>
+                <w:lang w:val="en-GB"/>
+              </w:rPr>
+              <w:t>random_forest*</w:t>
+            </w:r>
+          </w:p>
+        </w:tc>
+        <w:tc>
+          <w:tcPr>
+            <w:tcW w:w="1000" w:type="dxa"/>
+          </w:tcPr>
+          <w:p>
+            <w:pPr>
+              <w:pStyle w:val="PARAGRAPH"/>
+              <w:ind w:firstLine="0"/>
+              <w:rPr>
+                <w:rFonts w:ascii="Times New Roman" w:hAnsi="Times New Roman"/>
+                <w:sz w:val="18"/>
+                <w:lang w:val="en-GB"/>
+              </w:rPr>
+            </w:pPr>
+            <w:r>
+              <w:rPr>
+                <w:rFonts w:ascii="Times New Roman" w:hAnsi="Times New Roman"/>
+                <w:sz w:val="18"/>
+                <w:lang w:val="en-GB"/>
+              </w:rPr>
+              <w:t>0.827</w:t>
+            </w:r>
+          </w:p>
+        </w:tc>
+        <w:tc>
+          <w:tcPr>
+            <w:tcW w:w="1000" w:type="dxa"/>
+          </w:tcPr>
+          <w:p>
+            <w:pPr>
+              <w:pStyle w:val="PARAGRAPH"/>
+              <w:ind w:firstLine="0"/>
+              <w:rPr>
+                <w:rFonts w:ascii="Times New Roman" w:hAnsi="Times New Roman"/>
+                <w:sz w:val="18"/>
+                <w:lang w:val="en-GB"/>
+              </w:rPr>
+            </w:pPr>
+            <w:r>
+              <w:rPr>
+                <w:rFonts w:ascii="Times New Roman" w:hAnsi="Times New Roman"/>
+                <w:sz w:val="18"/>
+                <w:lang w:val="en-GB"/>
+              </w:rPr>
+              <w:t>0.664</w:t>
+            </w:r>
+          </w:p>
+        </w:tc>
+        <w:tc>
+          <w:tcPr>
+            <w:tcW w:w="1000" w:type="dxa"/>
+          </w:tcPr>
+          <w:p>
+            <w:pPr>
+              <w:pStyle w:val="PARAGRAPH"/>
+              <w:ind w:firstLine="0"/>
+              <w:rPr>
+                <w:rFonts w:ascii="Times New Roman" w:hAnsi="Times New Roman"/>
+                <w:sz w:val="18"/>
+                <w:lang w:val="en-GB"/>
+              </w:rPr>
+            </w:pPr>
+            <w:r>
+              <w:rPr>
+                <w:rFonts w:ascii="Times New Roman" w:hAnsi="Times New Roman"/>
+                <w:sz w:val="18"/>
+                <w:lang w:val="en-GB"/>
+              </w:rPr>
+              <w:t>0.889</w:t>
+            </w:r>
+          </w:p>
+        </w:tc>
+      </w:tr>
+      <w:tr>
+        <w:tblPrEx>
+          <w:tblCellMar>
+            <w:top w:w="0" w:type="dxa"/>
+            <w:bottom w:w="0" w:type="dxa"/>
+          </w:tblCellMar>
+        </w:tblPrEx>
+        <w:tc>
+          <w:tcPr>
+            <w:tcW w:w="1600" w:type="dxa"/>
+          </w:tcPr>
+          <w:p>
+            <w:pPr>
+              <w:pStyle w:val="PARAGRAPH"/>
+              <w:ind w:firstLine="0"/>
+              <w:rPr>
+                <w:rFonts w:ascii="Times New Roman" w:hAnsi="Times New Roman"/>
+                <w:sz w:val="18"/>
+                <w:lang w:val="en-GB"/>
+              </w:rPr>
+            </w:pPr>
+            <w:r>
+              <w:rPr>
+                <w:rFonts w:ascii="Times New Roman" w:hAnsi="Times New Roman"/>
+                <w:sz w:val="18"/>
+                <w:lang w:val="en-GB"/>
+              </w:rPr>
+              <w:t>gradient_boosting</w:t>
+            </w:r>
+          </w:p>
+        </w:tc>
+        <w:tc>
+          <w:tcPr>
+            <w:tcW w:w="1000" w:type="dxa"/>
+          </w:tcPr>
+          <w:p>
+            <w:pPr>
+              <w:pStyle w:val="PARAGRAPH"/>
+              <w:ind w:firstLine="0"/>
+              <w:rPr>
+                <w:rFonts w:ascii="Times New Roman" w:hAnsi="Times New Roman"/>
+                <w:sz w:val="18"/>
+                <w:lang w:val="en-GB"/>
+              </w:rPr>
+            </w:pPr>
+            <w:r>
+              <w:rPr>
+                <w:rFonts w:ascii="Times New Roman" w:hAnsi="Times New Roman"/>
+                <w:sz w:val="18"/>
+                <w:lang w:val="en-GB"/>
+              </w:rPr>
+              <w:t>0.839</w:t>
+            </w:r>
+          </w:p>
+        </w:tc>
+        <w:tc>
+          <w:tcPr>
+            <w:tcW w:w="1000" w:type="dxa"/>
+          </w:tcPr>
+          <w:p>
+            <w:pPr>
+              <w:pStyle w:val="PARAGRAPH"/>
+              <w:ind w:firstLine="0"/>
+              <w:rPr>
+                <w:rFonts w:ascii="Times New Roman" w:hAnsi="Times New Roman"/>
+                <w:sz w:val="18"/>
+                <w:lang w:val="en-GB"/>
+              </w:rPr>
+            </w:pPr>
+            <w:r>
+              <w:rPr>
+                <w:rFonts w:ascii="Times New Roman" w:hAnsi="Times New Roman"/>
+                <w:sz w:val="18"/>
+                <w:lang w:val="en-GB"/>
+              </w:rPr>
+              <w:t>0.626</w:t>
+            </w:r>
+          </w:p>
+        </w:tc>
+        <w:tc>
+          <w:tcPr>
+            <w:tcW w:w="1000" w:type="dxa"/>
+          </w:tcPr>
+          <w:p>
+            <w:pPr>
+              <w:pStyle w:val="PARAGRAPH"/>
+              <w:ind w:firstLine="0"/>
+              <w:rPr>
+                <w:rFonts w:ascii="Times New Roman" w:hAnsi="Times New Roman"/>
+                <w:sz w:val="18"/>
+                <w:lang w:val="en-GB"/>
+              </w:rPr>
+            </w:pPr>
+            <w:r>
+              <w:rPr>
+                <w:rFonts w:ascii="Times New Roman" w:hAnsi="Times New Roman"/>
+                <w:sz w:val="18"/>
+                <w:lang w:val="en-GB"/>
+              </w:rPr>
+              <w:t>0.8</w:t>
+            </w:r>
+            <w:r>
+              <w:rPr>
+                <w:rFonts w:ascii="Times New Roman" w:hAnsi="Times New Roman"/>
+                <w:sz w:val="18"/>
+                <w:lang w:val="en-GB"/>
+              </w:rPr>
+              <w:t>91</w:t>
+            </w:r>
+          </w:p>
+        </w:tc>
+      </w:tr>
+    </w:tbl>
+    <w:p>
+      <w:pPr>
+        <w:pStyle w:val="PARAGRAPH"/>
+        <w:ind w:firstLine="317"/>
+        <w:rPr>
+          <w:rFonts w:ascii="Times New Roman" w:hAnsi="Times New Roman"/>
+          <w:sz w:val="20"/>
+          <w:lang w:val="en-GB"/>
+        </w:rPr>
       </w:pPr>
     </w:p>
     <w:p>
       <w:pPr>
         <w:pStyle w:val="PARAGRAPH"/>
+        <w:ind w:firstLine="317"/>
+        <w:rPr>
+          <w:rFonts w:ascii="Times New Roman" w:hAnsi="Times New Roman"/>
+          <w:sz w:val="20"/>
+          <w:lang w:val="en-GB"/>
+        </w:rPr>
+      </w:pPr>
+    </w:p>
+    <w:p>
+      <w:pPr>
+        <w:pStyle w:val="PARAGRAPH"/>
         <w:ind w:firstLine="0"/>
+        <w:rPr>
+          <w:rFonts w:ascii="Times New Roman" w:hAnsi="Times New Roman"/>
+          <w:lang w:val="en-GB"/>
+        </w:rPr>
+      </w:pPr>
+    </w:p>
+    <w:p>
+      <w:pPr>
+        <w:pStyle w:val="1"/>
+        <w:spacing w:before="0" w:after="0" w:line="230" w:lineRule="exact"/>
+        <w:ind w:left="317" w:hanging="317"/>
         <w:rPr>
           <w:rFonts w:ascii="Times New Roman" w:hAnsi="Times New Roman"/>
           <w:color w:val="000000"/>
@@ -270,6 +884,7 @@
           <w:lang w:val="en-GB"/>
         </w:rPr>
       </w:pPr>
+      <w:bookmarkStart w:id="2" w:name="_Hlk505887282"/>
       <w:r>
         <w:rPr>
           <w:rFonts w:ascii="Times New Roman" w:hAnsi="Times New Roman"/>
@@ -277,7 +892,7 @@
           <w:sz w:val="20"/>
           <w:lang w:val="en-GB"/>
         </w:rPr>
-        <w:pict w14:anchorId="63D4342B">
+        <w:pict w14:anchorId="0FABFD01">
           <v:shapetype id="_x0000_t75" coordsize="21600,21600" o:spt="75" o:preferrelative="t" path="m@4@5l@4@11@9@11@9@5xe" filled="f" stroked="f">
             <v:stroke joinstyle="miter"/>
             <v:formulas>
@@ -297,471 +912,24 @@
             <v:path o:extrusionok="f" gradientshapeok="t" o:connecttype="rect"/>
             <o:lock v:ext="edit" aspectratio="t"/>
           </v:shapetype>
-          <v:shape id="_x0000_i1025" type="#_x0000_t75" style="width:229pt;height:200.5pt">
+          <v:shape id="_x0000_i1025" type="#_x0000_t75" style="width:113pt;height:85pt">
             <v:imagedata r:id="rId14" o:title="confusion_matrix"/>
           </v:shape>
         </w:pict>
       </w:r>
-      <w:r>
+    </w:p>
+    <w:p>
+      <w:pPr>
+        <w:pStyle w:val="1"/>
+        <w:spacing w:before="0" w:after="0" w:line="230" w:lineRule="exact"/>
+        <w:ind w:left="317" w:hanging="317"/>
         <w:rPr>
           <w:rFonts w:ascii="Times New Roman" w:hAnsi="Times New Roman"/>
           <w:color w:val="000000"/>
           <w:sz w:val="20"/>
           <w:lang w:val="en-GB"/>
         </w:rPr>
-        <w:t>Model</w:t>
-      </w:r>
-      <w:r>
-        <w:rPr>
-          <w:rFonts w:ascii="Times New Roman" w:hAnsi="Times New Roman"/>
-          <w:color w:val="000000"/>
-          <w:sz w:val="20"/>
-          <w:lang w:val="en-GB"/>
-        </w:rPr>
-        <w:tab/>
-        <w:t>Accuracy</w:t>
-      </w:r>
-      <w:r>
-        <w:rPr>
-          <w:rFonts w:ascii="Times New Roman" w:hAnsi="Times New Roman"/>
-          <w:color w:val="000000"/>
-          <w:sz w:val="20"/>
-          <w:lang w:val="en-GB"/>
-        </w:rPr>
-        <w:tab/>
-        <w:t>Precision</w:t>
-      </w:r>
-      <w:r>
-        <w:rPr>
-          <w:rFonts w:ascii="Times New Roman" w:hAnsi="Times New Roman"/>
-          <w:color w:val="000000"/>
-          <w:sz w:val="20"/>
-          <w:lang w:val="en-GB"/>
-        </w:rPr>
-        <w:tab/>
-        <w:t>Recall</w:t>
-      </w:r>
-      <w:r>
-        <w:rPr>
-          <w:rFonts w:ascii="Times New Roman" w:hAnsi="Times New Roman"/>
-          <w:color w:val="000000"/>
-          <w:sz w:val="20"/>
-          <w:lang w:val="en-GB"/>
-        </w:rPr>
-        <w:tab/>
-        <w:t>F1</w:t>
-      </w:r>
-      <w:r>
-        <w:rPr>
-          <w:rFonts w:ascii="Times New Roman" w:hAnsi="Times New Roman"/>
-          <w:color w:val="000000"/>
-          <w:sz w:val="20"/>
-          <w:lang w:val="en-GB"/>
-        </w:rPr>
-        <w:tab/>
-        <w:t>ROC-AUC</w:t>
-      </w:r>
-      <w:r>
-        <w:rPr>
-          <w:rFonts w:ascii="Times New Roman" w:hAnsi="Times New Roman"/>
-          <w:color w:val="000000"/>
-          <w:sz w:val="20"/>
-          <w:lang w:val="en-GB"/>
-        </w:rPr>
-        <w:tab/>
-        <w:t>PR-AUC</w:t>
-      </w:r>
-    </w:p>
-    <w:p>
-      <w:pPr>
-        <w:pStyle w:val="PARAGRAPH"/>
-        <w:ind w:firstLine="0"/>
-        <w:rPr>
-          <w:rFonts w:ascii="Times New Roman" w:hAnsi="Times New Roman"/>
-          <w:color w:val="000000"/>
-          <w:sz w:val="20"/>
-          <w:lang w:val="en-GB"/>
-        </w:rPr>
-      </w:pPr>
-      <w:r>
-        <w:rPr>
-          <w:rFonts w:ascii="Times New Roman" w:hAnsi="Times New Roman"/>
-          <w:color w:val="000000"/>
-          <w:sz w:val="20"/>
-          <w:lang w:val="en-GB"/>
-        </w:rPr>
-        <w:t>dummy</w:t>
-      </w:r>
-      <w:r>
-        <w:rPr>
-          <w:rFonts w:ascii="Times New Roman" w:hAnsi="Times New Roman"/>
-          <w:color w:val="000000"/>
-          <w:sz w:val="20"/>
-          <w:lang w:val="en-GB"/>
-        </w:rPr>
-        <w:tab/>
-        <w:t>0.6351</w:t>
-      </w:r>
-      <w:r>
-        <w:rPr>
-          <w:rFonts w:ascii="Times New Roman" w:hAnsi="Times New Roman"/>
-          <w:color w:val="000000"/>
-          <w:sz w:val="20"/>
-          <w:lang w:val="en-GB"/>
-        </w:rPr>
-        <w:tab/>
-        <w:t>0.2365</w:t>
-      </w:r>
-      <w:r>
-        <w:rPr>
-          <w:rFonts w:ascii="Times New Roman" w:hAnsi="Times New Roman"/>
-          <w:color w:val="000000"/>
-          <w:sz w:val="20"/>
-          <w:lang w:val="en-GB"/>
-        </w:rPr>
-        <w:tab/>
-        <w:t>0.2337</w:t>
-      </w:r>
-      <w:r>
-        <w:rPr>
-          <w:rFonts w:ascii="Times New Roman" w:hAnsi="Times New Roman"/>
-          <w:color w:val="000000"/>
-          <w:sz w:val="20"/>
-          <w:lang w:val="en-GB"/>
-        </w:rPr>
-        <w:tab/>
-        <w:t>0.2351</w:t>
-      </w:r>
-      <w:r>
-        <w:rPr>
-          <w:rFonts w:ascii="Times New Roman" w:hAnsi="Times New Roman"/>
-          <w:color w:val="000000"/>
-          <w:sz w:val="20"/>
-          <w:lang w:val="en-GB"/>
-        </w:rPr>
-        <w:tab/>
-        <w:t>0.4978</w:t>
-      </w:r>
-      <w:r>
-        <w:rPr>
-          <w:rFonts w:ascii="Times New Roman" w:hAnsi="Times New Roman"/>
-          <w:color w:val="000000"/>
-          <w:sz w:val="20"/>
-          <w:lang w:val="en-GB"/>
-        </w:rPr>
-        <w:tab/>
-        <w:t>0.2391</w:t>
-      </w:r>
-    </w:p>
-    <w:p>
-      <w:pPr>
-        <w:pStyle w:val="PARAGRAPH"/>
-        <w:ind w:firstLine="0"/>
-        <w:rPr>
-          <w:rFonts w:ascii="Times New Roman" w:hAnsi="Times New Roman"/>
-          <w:color w:val="000000"/>
-          <w:sz w:val="20"/>
-          <w:lang w:val="en-GB"/>
-        </w:rPr>
-      </w:pPr>
-      <w:r>
-        <w:rPr>
-          <w:rFonts w:ascii="Times New Roman" w:hAnsi="Times New Roman"/>
-          <w:color w:val="000000"/>
-          <w:sz w:val="20"/>
-          <w:lang w:val="en-GB"/>
-        </w:rPr>
-        <w:t>logistic_regression</w:t>
-      </w:r>
-      <w:r>
-        <w:rPr>
-          <w:rFonts w:ascii="Times New Roman" w:hAnsi="Times New Roman"/>
-          <w:color w:val="000000"/>
-          <w:sz w:val="20"/>
-          <w:lang w:val="en-GB"/>
-        </w:rPr>
-        <w:tab/>
-        <w:t>0.7903</w:t>
-      </w:r>
-      <w:r>
-        <w:rPr>
-          <w:rFonts w:ascii="Times New Roman" w:hAnsi="Times New Roman"/>
-          <w:color w:val="000000"/>
-          <w:sz w:val="20"/>
-          <w:lang w:val="en-GB"/>
-        </w:rPr>
-        <w:tab/>
-        <w:t>0.5401</w:t>
-      </w:r>
-      <w:r>
-        <w:rPr>
-          <w:rFonts w:ascii="Times New Roman" w:hAnsi="Times New Roman"/>
-          <w:color w:val="000000"/>
-          <w:sz w:val="20"/>
-          <w:lang w:val="en-GB"/>
-        </w:rPr>
-        <w:tab/>
-        <w:t>0.8493</w:t>
-      </w:r>
-      <w:r>
-        <w:rPr>
-          <w:rFonts w:ascii="Times New Roman" w:hAnsi="Times New Roman"/>
-          <w:color w:val="000000"/>
-          <w:sz w:val="20"/>
-          <w:lang w:val="en-GB"/>
-        </w:rPr>
-        <w:tab/>
-        <w:t>0.6602</w:t>
-      </w:r>
-      <w:r>
-        <w:rPr>
-          <w:rFonts w:ascii="Times New Roman" w:hAnsi="Times New Roman"/>
-          <w:color w:val="000000"/>
-          <w:sz w:val="20"/>
-          <w:lang w:val="en-GB"/>
-        </w:rPr>
-        <w:tab/>
-        <w:t>0.8905</w:t>
-      </w:r>
-      <w:r>
-        <w:rPr>
-          <w:rFonts w:ascii="Times New Roman" w:hAnsi="Times New Roman"/>
-          <w:color w:val="000000"/>
-          <w:sz w:val="20"/>
-          <w:lang w:val="en-GB"/>
-        </w:rPr>
-        <w:tab/>
-        <w:t>0.7049</w:t>
-      </w:r>
-    </w:p>
-    <w:p>
-      <w:pPr>
-        <w:pStyle w:val="PARAGRAPH"/>
-        <w:ind w:firstLine="0"/>
-        <w:rPr>
-          <w:rFonts w:ascii="Times New Roman" w:hAnsi="Times New Roman"/>
-          <w:color w:val="000000"/>
-          <w:sz w:val="20"/>
-          <w:lang w:val="en-GB"/>
-        </w:rPr>
-      </w:pPr>
-      <w:r>
-        <w:rPr>
-          <w:rFonts w:ascii="Times New Roman" w:hAnsi="Times New Roman"/>
-          <w:color w:val="000000"/>
-          <w:sz w:val="20"/>
-          <w:lang w:val="en-GB"/>
-        </w:rPr>
-        <w:t>random_forest (best)</w:t>
-      </w:r>
-      <w:r>
-        <w:rPr>
-          <w:rFonts w:ascii="Times New Roman" w:hAnsi="Times New Roman"/>
-          <w:color w:val="000000"/>
-          <w:sz w:val="20"/>
-          <w:lang w:val="en-GB"/>
-        </w:rPr>
-        <w:tab/>
-        <w:t>0.8266</w:t>
-      </w:r>
-      <w:r>
-        <w:rPr>
-          <w:rFonts w:ascii="Times New Roman" w:hAnsi="Times New Roman"/>
-          <w:color w:val="000000"/>
-          <w:sz w:val="20"/>
-          <w:lang w:val="en-GB"/>
-        </w:rPr>
-        <w:tab/>
-        <w:t>0.6204</w:t>
-      </w:r>
-      <w:r>
-        <w:rPr>
-          <w:rFonts w:ascii="Times New Roman" w:hAnsi="Times New Roman"/>
-          <w:color w:val="000000"/>
-          <w:sz w:val="20"/>
-          <w:lang w:val="en-GB"/>
-        </w:rPr>
-        <w:tab/>
-        <w:t>0.7146</w:t>
-      </w:r>
-      <w:r>
-        <w:rPr>
-          <w:rFonts w:ascii="Times New Roman" w:hAnsi="Times New Roman"/>
-          <w:color w:val="000000"/>
-          <w:sz w:val="20"/>
-          <w:lang w:val="en-GB"/>
-        </w:rPr>
-        <w:tab/>
-        <w:t>0.6641</w:t>
-      </w:r>
-      <w:r>
-        <w:rPr>
-          <w:rFonts w:ascii="Times New Roman" w:hAnsi="Times New Roman"/>
-          <w:color w:val="000000"/>
-          <w:sz w:val="20"/>
-          <w:lang w:val="en-GB"/>
-        </w:rPr>
-        <w:tab/>
-        <w:t>0.8892</w:t>
-      </w:r>
-      <w:r>
-        <w:rPr>
-          <w:rFonts w:ascii="Times New Roman" w:hAnsi="Times New Roman"/>
-          <w:color w:val="000000"/>
-          <w:sz w:val="20"/>
-          <w:lang w:val="en-GB"/>
-        </w:rPr>
-        <w:tab/>
-        <w:t>0.7058</w:t>
-      </w:r>
-    </w:p>
-    <w:p>
-      <w:pPr>
-        <w:pStyle w:val="PARAGRAPH"/>
-        <w:ind w:firstLine="0"/>
-        <w:rPr>
-          <w:rFonts w:ascii="Times New Roman" w:hAnsi="Times New Roman"/>
-          <w:color w:val="000000"/>
-          <w:sz w:val="20"/>
-          <w:lang w:val="en-GB"/>
-        </w:rPr>
-      </w:pPr>
-      <w:r>
-        <w:rPr>
-          <w:rFonts w:ascii="Times New Roman" w:hAnsi="Times New Roman"/>
-          <w:color w:val="000000"/>
-          <w:sz w:val="20"/>
-          <w:lang w:val="en-GB"/>
-        </w:rPr>
-        <w:t>gradient_boosting</w:t>
-      </w:r>
-      <w:r>
-        <w:rPr>
-          <w:rFonts w:ascii="Times New Roman" w:hAnsi="Times New Roman"/>
-          <w:color w:val="000000"/>
-          <w:sz w:val="20"/>
-          <w:lang w:val="en-GB"/>
-        </w:rPr>
-        <w:tab/>
-        <w:t>0.8392</w:t>
-      </w:r>
-      <w:r>
-        <w:rPr>
-          <w:rFonts w:ascii="Times New Roman" w:hAnsi="Times New Roman"/>
-          <w:color w:val="000000"/>
-          <w:sz w:val="20"/>
-          <w:lang w:val="en-GB"/>
-        </w:rPr>
-        <w:tab/>
-        <w:t>0.7083</w:t>
-      </w:r>
-      <w:r>
-        <w:rPr>
-          <w:rFonts w:ascii="Times New Roman" w:hAnsi="Times New Roman"/>
-          <w:color w:val="000000"/>
-          <w:sz w:val="20"/>
-          <w:lang w:val="en-GB"/>
-        </w:rPr>
-        <w:tab/>
-        <w:t>0.5610</w:t>
-      </w:r>
-      <w:r>
-        <w:rPr>
-          <w:rFonts w:ascii="Times New Roman" w:hAnsi="Times New Roman"/>
-          <w:color w:val="000000"/>
-          <w:sz w:val="20"/>
-          <w:lang w:val="en-GB"/>
-        </w:rPr>
-        <w:tab/>
-        <w:t>0.6260</w:t>
-      </w:r>
-      <w:r>
-        <w:rPr>
-          <w:rFonts w:ascii="Times New Roman" w:hAnsi="Times New Roman"/>
-          <w:color w:val="000000"/>
-          <w:sz w:val="20"/>
-          <w:lang w:val="en-GB"/>
-        </w:rPr>
-        <w:tab/>
-        <w:t>0.8913</w:t>
-      </w:r>
-      <w:r>
-        <w:rPr>
-          <w:rFonts w:ascii="Times New Roman" w:hAnsi="Times New Roman"/>
-          <w:color w:val="000000"/>
-          <w:sz w:val="20"/>
-          <w:lang w:val="en-GB"/>
-        </w:rPr>
-        <w:tab/>
-        <w:t>0.7131</w:t>
-      </w:r>
-    </w:p>
-    <w:p>
-      <w:pPr>
-        <w:pStyle w:val="PARAGRAPH"/>
-        <w:ind w:firstLine="0"/>
-        <w:rPr>
-          <w:rFonts w:ascii="Times New Roman" w:hAnsi="Times New Roman"/>
-          <w:color w:val="000000"/>
-          <w:sz w:val="20"/>
-          <w:lang w:val="en-GB"/>
-        </w:rPr>
-      </w:pPr>
-    </w:p>
-    <w:p>
-      <w:pPr>
-        <w:pStyle w:val="PARAGRAPH"/>
-        <w:ind w:firstLine="0"/>
-        <w:rPr>
-          <w:rFonts w:ascii="Times New Roman" w:hAnsi="Times New Roman"/>
-          <w:sz w:val="20"/>
-          <w:lang w:val="en-GB"/>
-        </w:rPr>
-      </w:pPr>
-      <w:r>
-        <w:rPr>
-          <w:rFonts w:ascii="Times New Roman" w:hAnsi="Times New Roman"/>
-          <w:color w:val="000000"/>
-          <w:sz w:val="20"/>
-          <w:lang w:val="en-GB"/>
-        </w:rPr>
-        <w:t>Test-set performance (best model: random_forest): accuracy=0.8272, precision=0.6177, recall=0.7156, F1=0.6631, ROC-AUC=0.8887, PR-AUC=0.7010.</w:t>
-      </w:r>
-    </w:p>
-    <w:p>
-      <w:pPr>
-        <w:pStyle w:val="PARAGRAPH"/>
-        <w:ind w:firstLine="317"/>
-        <w:rPr>
-          <w:rFonts w:ascii="Times New Roman" w:hAnsi="Times New Roman"/>
-          <w:sz w:val="20"/>
-          <w:lang w:val="en-GB"/>
-        </w:rPr>
-      </w:pPr>
-    </w:p>
-    <w:p>
-      <w:pPr>
-        <w:pStyle w:val="PARAGRAPH"/>
-        <w:ind w:firstLine="0"/>
-        <w:rPr>
-          <w:rFonts w:ascii="Times New Roman" w:hAnsi="Times New Roman"/>
-          <w:lang w:val="en-GB"/>
-        </w:rPr>
-      </w:pPr>
-    </w:p>
-    <w:p>
-      <w:pPr>
-        <w:pStyle w:val="1"/>
-        <w:spacing w:before="0" w:after="0" w:line="230" w:lineRule="exact"/>
-        <w:ind w:left="317" w:hanging="317"/>
-        <w:rPr>
-          <w:rFonts w:ascii="Times New Roman" w:hAnsi="Times New Roman"/>
-          <w:color w:val="000000"/>
-          <w:sz w:val="20"/>
-          <w:lang w:val="en-GB"/>
-        </w:rPr>
-      </w:pPr>
-      <w:bookmarkStart w:id="2" w:name="_Hlk505887282"/>
+      </w:pPr>
       <w:r>
         <w:rPr>
           <w:rFonts w:ascii="Times New Roman" w:hAnsi="Times New Roman"/>
@@ -793,9 +961,24 @@
     </w:p>
     <w:p>
       <w:pPr>
-        <w:pStyle w:val="PARAGRAPHnoindent"/>
+        <w:pStyle w:val="PARAGRAPH"/>
+        <w:ind w:firstLine="0"/>
+        <w:rPr>
+          <w:rFonts w:ascii="Times New Roman" w:hAnsi="Times New Roman"/>
+          <w:color w:val="000000"/>
+          <w:spacing w:val="-2"/>
+          <w:sz w:val="20"/>
+          <w:lang w:val="en-GB"/>
+        </w:rPr>
       </w:pPr>
       <w:r>
+        <w:rPr>
+          <w:rFonts w:ascii="Times New Roman" w:hAnsi="Times New Roman"/>
+          <w:color w:val="000000"/>
+          <w:spacing w:val="-2"/>
+          <w:sz w:val="20"/>
+          <w:lang w:val="en-GB"/>
+        </w:rPr>
         <w:t>Best model: random_forest, selected by CV F1=0.6641. Its advantage over LogisticRegression (CV F1=0.6602) was small (delta=0.0039); the two models are comparable in discriminative power. The Dummy baseline (F1=0.2351) confirms a no-information classifier performs well below all meaningful models. LogisticRegression achieves higher recall (0.849 vs 0.715) at the cost of lower precision (0.540 vs 0.620). Test F1 (0.6631) closely matches CV F1 (0.6641), indicating stable generalisation.</w:t>
       </w:r>
     </w:p>
@@ -842,10 +1025,19 @@
     </w:p>
     <w:p>
       <w:pPr>
-        <w:pStyle w:val="PARAGRAPHnoindent"/>
+        <w:pStyle w:val="Text"/>
+        <w:ind w:firstLine="0"/>
+        <w:rPr>
+          <w:color w:val="000000"/>
+          <w:lang w:val="en-GB"/>
+        </w:rPr>
       </w:pPr>
       <w:r>
-        <w:t>The SKILL successfully builds a reusable, leakage-safe tabular classification pipeline. RandomForest was selected as the best model by CV F1, though the margin over LogisticRegression was small. All numerical values are pulled from results.json. Model: GLM-5.2; LLM interface: TraeCode (Codex); GitHub: [PLACEHOLDER: Enter your GitHub repository link].</w:t>
+        <w:rPr>
+          <w:color w:val="000000"/>
+          <w:lang w:val="en-GB"/>
+        </w:rPr>
+        <w:t>The SKILL successfully builds a reusable, leakage-safe tabular classification pipeline. RandomForest was selected as the best model by CV F1, though the margin over LogisticRegression was small. All numerical values are pulled from results.json.</w:t>
       </w:r>
     </w:p>
     <w:p>
@@ -1004,6 +1196,24 @@
           <w:lang w:val="en-GB"/>
         </w:rPr>
         <w:t>Matric number: G2608825L</w:t>
+      </w:r>
+    </w:p>
+    <w:p>
+      <w:pPr>
+        <w:pStyle w:val="VITA"/>
+        <w:rPr>
+          <w:rFonts w:ascii="Times New Roman" w:hAnsi="Times New Roman"/>
+          <w:sz w:val="20"/>
+          <w:lang w:val="en-GB"/>
+        </w:rPr>
+      </w:pPr>
+      <w:r>
+        <w:rPr>
+          <w:rFonts w:ascii="Times New Roman" w:hAnsi="Times New Roman"/>
+          <w:sz w:val="20"/>
+          <w:lang w:val="en-GB"/>
+        </w:rPr>
+        <w:t>Assignment: IN6227-2023-Assignment-1, Variant 2</w:t>
       </w:r>
     </w:p>
     <w:p>
@@ -4543,10 +4753,10 @@
       </w:rPr>
     </w:lvl>
   </w:abstractNum>
-  <w:num w:numId="1" w16cid:durableId="1240292431">
+  <w:num w:numId="1" w16cid:durableId="1610160458">
     <w:abstractNumId w:val="28"/>
   </w:num>
-  <w:num w:numId="2" w16cid:durableId="503937633">
+  <w:num w:numId="2" w16cid:durableId="1437481319">
     <w:abstractNumId w:val="1"/>
     <w:lvlOverride w:ilvl="0">
       <w:lvl w:ilvl="0">
@@ -4564,13 +4774,13 @@
       </w:lvl>
     </w:lvlOverride>
   </w:num>
-  <w:num w:numId="3" w16cid:durableId="1021511193">
+  <w:num w:numId="3" w16cid:durableId="1682313152">
     <w:abstractNumId w:val="39"/>
   </w:num>
-  <w:num w:numId="4" w16cid:durableId="541290674">
+  <w:num w:numId="4" w16cid:durableId="1613895590">
     <w:abstractNumId w:val="5"/>
   </w:num>
-  <w:num w:numId="5" w16cid:durableId="1029913189">
+  <w:num w:numId="5" w16cid:durableId="2115124646">
     <w:abstractNumId w:val="1"/>
     <w:lvlOverride w:ilvl="0">
       <w:lvl w:ilvl="0">
@@ -4588,34 +4798,34 @@
       </w:lvl>
     </w:lvlOverride>
   </w:num>
-  <w:num w:numId="6" w16cid:durableId="1774547549">
+  <w:num w:numId="6" w16cid:durableId="1028990281">
     <w:abstractNumId w:val="16"/>
   </w:num>
-  <w:num w:numId="7" w16cid:durableId="725109276">
+  <w:num w:numId="7" w16cid:durableId="401372935">
     <w:abstractNumId w:val="23"/>
   </w:num>
-  <w:num w:numId="8" w16cid:durableId="1573656788">
+  <w:num w:numId="8" w16cid:durableId="219680547">
     <w:abstractNumId w:val="36"/>
   </w:num>
-  <w:num w:numId="9" w16cid:durableId="812989465">
+  <w:num w:numId="9" w16cid:durableId="1601836274">
     <w:abstractNumId w:val="11"/>
   </w:num>
-  <w:num w:numId="10" w16cid:durableId="1314796831">
+  <w:num w:numId="10" w16cid:durableId="827861062">
     <w:abstractNumId w:val="18"/>
   </w:num>
-  <w:num w:numId="11" w16cid:durableId="614094127">
+  <w:num w:numId="11" w16cid:durableId="942494996">
     <w:abstractNumId w:val="10"/>
   </w:num>
-  <w:num w:numId="12" w16cid:durableId="780994937">
+  <w:num w:numId="12" w16cid:durableId="561717207">
     <w:abstractNumId w:val="9"/>
   </w:num>
-  <w:num w:numId="13" w16cid:durableId="499196056">
+  <w:num w:numId="13" w16cid:durableId="1101493688">
     <w:abstractNumId w:val="0"/>
   </w:num>
-  <w:num w:numId="14" w16cid:durableId="362366143">
+  <w:num w:numId="14" w16cid:durableId="1787697893">
     <w:abstractNumId w:val="17"/>
   </w:num>
-  <w:num w:numId="15" w16cid:durableId="537546182">
+  <w:num w:numId="15" w16cid:durableId="187106832">
     <w:abstractNumId w:val="17"/>
     <w:lvlOverride w:ilvl="0">
       <w:lvl w:ilvl="0">
@@ -4630,10 +4840,10 @@
       </w:lvl>
     </w:lvlOverride>
   </w:num>
-  <w:num w:numId="16" w16cid:durableId="1678576149">
+  <w:num w:numId="16" w16cid:durableId="1157458752">
     <w:abstractNumId w:val="24"/>
   </w:num>
-  <w:num w:numId="17" w16cid:durableId="2031031536">
+  <w:num w:numId="17" w16cid:durableId="1376387311">
     <w:abstractNumId w:val="24"/>
     <w:lvlOverride w:ilvl="0">
       <w:lvl w:ilvl="0">
@@ -4648,85 +4858,85 @@
       </w:lvl>
     </w:lvlOverride>
   </w:num>
-  <w:num w:numId="18" w16cid:durableId="1856461252">
+  <w:num w:numId="18" w16cid:durableId="14425434">
     <w:abstractNumId w:val="19"/>
   </w:num>
-  <w:num w:numId="19" w16cid:durableId="2082941187">
+  <w:num w:numId="19" w16cid:durableId="1015307418">
     <w:abstractNumId w:val="12"/>
   </w:num>
-  <w:num w:numId="20" w16cid:durableId="197663387">
+  <w:num w:numId="20" w16cid:durableId="1133910484">
     <w:abstractNumId w:val="30"/>
   </w:num>
-  <w:num w:numId="21" w16cid:durableId="1634169292">
+  <w:num w:numId="21" w16cid:durableId="545722548">
     <w:abstractNumId w:val="25"/>
   </w:num>
-  <w:num w:numId="22" w16cid:durableId="1778670316">
+  <w:num w:numId="22" w16cid:durableId="256328528">
     <w:abstractNumId w:val="37"/>
   </w:num>
-  <w:num w:numId="23" w16cid:durableId="1558274429">
+  <w:num w:numId="23" w16cid:durableId="641615370">
     <w:abstractNumId w:val="14"/>
   </w:num>
-  <w:num w:numId="24" w16cid:durableId="1299989843">
+  <w:num w:numId="24" w16cid:durableId="1069231723">
     <w:abstractNumId w:val="13"/>
   </w:num>
-  <w:num w:numId="25" w16cid:durableId="977339963">
+  <w:num w:numId="25" w16cid:durableId="231695468">
     <w:abstractNumId w:val="35"/>
   </w:num>
-  <w:num w:numId="26" w16cid:durableId="812482356">
+  <w:num w:numId="26" w16cid:durableId="1048262832">
     <w:abstractNumId w:val="20"/>
   </w:num>
-  <w:num w:numId="27" w16cid:durableId="1003506737">
+  <w:num w:numId="27" w16cid:durableId="2030599945">
     <w:abstractNumId w:val="32"/>
   </w:num>
-  <w:num w:numId="28" w16cid:durableId="1269507398">
+  <w:num w:numId="28" w16cid:durableId="1077553033">
     <w:abstractNumId w:val="4"/>
   </w:num>
-  <w:num w:numId="29" w16cid:durableId="659429497">
+  <w:num w:numId="29" w16cid:durableId="1953439329">
     <w:abstractNumId w:val="2"/>
   </w:num>
-  <w:num w:numId="30" w16cid:durableId="446241955">
+  <w:num w:numId="30" w16cid:durableId="674264825">
     <w:abstractNumId w:val="6"/>
   </w:num>
-  <w:num w:numId="31" w16cid:durableId="1169710370">
+  <w:num w:numId="31" w16cid:durableId="2065375102">
     <w:abstractNumId w:val="21"/>
   </w:num>
-  <w:num w:numId="32" w16cid:durableId="506137635">
+  <w:num w:numId="32" w16cid:durableId="1770807367">
     <w:abstractNumId w:val="38"/>
   </w:num>
-  <w:num w:numId="33" w16cid:durableId="1602566961">
+  <w:num w:numId="33" w16cid:durableId="1370566182">
     <w:abstractNumId w:val="27"/>
   </w:num>
-  <w:num w:numId="34" w16cid:durableId="277495753">
+  <w:num w:numId="34" w16cid:durableId="306128627">
     <w:abstractNumId w:val="22"/>
   </w:num>
-  <w:num w:numId="35" w16cid:durableId="1391919566">
+  <w:num w:numId="35" w16cid:durableId="1832913186">
     <w:abstractNumId w:val="31"/>
   </w:num>
-  <w:num w:numId="36" w16cid:durableId="1653749535">
+  <w:num w:numId="36" w16cid:durableId="2101096820">
     <w:abstractNumId w:val="33"/>
   </w:num>
-  <w:num w:numId="37" w16cid:durableId="1509715787">
+  <w:num w:numId="37" w16cid:durableId="1833373607">
     <w:abstractNumId w:val="7"/>
   </w:num>
-  <w:num w:numId="38" w16cid:durableId="1313145294">
+  <w:num w:numId="38" w16cid:durableId="484051045">
     <w:abstractNumId w:val="8"/>
   </w:num>
-  <w:num w:numId="39" w16cid:durableId="1735467016">
+  <w:num w:numId="39" w16cid:durableId="1015502002">
     <w:abstractNumId w:val="15"/>
   </w:num>
-  <w:num w:numId="40" w16cid:durableId="2030250532">
+  <w:num w:numId="40" w16cid:durableId="1820805737">
     <w:abstractNumId w:val="34"/>
   </w:num>
-  <w:num w:numId="41" w16cid:durableId="1779635888">
+  <w:num w:numId="41" w16cid:durableId="1421875096">
     <w:abstractNumId w:val="29"/>
   </w:num>
-  <w:num w:numId="42" w16cid:durableId="276183597">
+  <w:num w:numId="42" w16cid:durableId="1450472512">
     <w:abstractNumId w:val="3"/>
   </w:num>
-  <w:num w:numId="43" w16cid:durableId="237177066">
+  <w:num w:numId="43" w16cid:durableId="461269253">
     <w:abstractNumId w:val="40"/>
   </w:num>
-  <w:num w:numId="44" w16cid:durableId="468478799">
+  <w:num w:numId="44" w16cid:durableId="1120416915">
     <w:abstractNumId w:val="26"/>
   </w:num>
 </w:numbering>

</xml_diff>